<commit_message>
Terms: replace the inactivity forfeiture with a pause right
Clause 11 previously let a stalled engagement keep consuming the Term with
fees remaining payable, so a client who went quiet for two months could
forfeit those months having received nothing. That is the clause most
likely to be struck as a penalty, and the one most likely to produce a
furious client and a public review.

Replace it: after 30 days of silence we write and check in; the client may
pause once per Term for up to 60 days with the Term extending by the same
period and nothing forfeited; if there is no response 30 days after that
notice we may terminate, retaining only the month in progress. Nothing is
now charged for a month in which no work was delivered.

Co-Authored-By: Claude Opus 4.8 <noreply@anthropic.com>
Claude-Session: https://claude.ai/code/session_01JQsb9C4aGD5GsEfhqjfSAJ
</commit_message>
<xml_diff>
--- a/docs/legal/Click-n-likes-Master-Services-Agreement-DRAFT.docx
+++ b/docs/legal/Click-n-likes-Master-Services-Agreement-DRAFT.docx
@@ -1429,7 +1429,7 @@
           <w:sz w:val="26"/>
           <w:szCs w:val="26"/>
         </w:rPr>
-        <w:t xml:space="preserve">11. Client delay and inactivity</w:t>
+        <w:t xml:space="preserve">11. Client delay, pause and inactivity</w:t>
       </w:r>
     </w:p>
     <w:p>
@@ -1452,7 +1452,7 @@
           <w:sz w:val="21"/>
           <w:szCs w:val="21"/>
         </w:rPr>
-        <w:t xml:space="preserve">If the Client fails to provide materials, approvals, access or information for a continuous period of 30 days, we may treat the engagement as inactive.</w:t>
+        <w:t xml:space="preserve">If the Client does not provide the materials, approvals, access or information we need for a continuous period of 30 days, we will write to the Client to say so. We will not treat an engagement as stalled without giving that notice first.</w:t>
       </w:r>
     </w:p>
     <w:p>
@@ -1475,7 +1475,7 @@
           <w:sz w:val="21"/>
           <w:szCs w:val="21"/>
         </w:rPr>
-        <w:t xml:space="preserve">An inactive engagement continues to consume the Term, and Fees for the affected months remain payable, because our capacity has been reserved and cannot be reallocated at short notice. We will give written notice before treating an engagement as inactive.</w:t>
+        <w:t xml:space="preserve">Pause. On receiving that notice, or at any time on request, the Client may pause the engagement once per Term for up to 60 days. The Term and any Complimentary Months extend by the length of the pause, and no Fees are lost or forfeited for the paused period. A pause must be requested in writing and takes effect from the date we acknowledge it.</w:t>
       </w:r>
     </w:p>
     <w:p>
@@ -1498,7 +1498,30 @@
           <w:sz w:val="21"/>
           <w:szCs w:val="21"/>
         </w:rPr>
-        <w:t xml:space="preserve">If inactivity continues for 60 days, we may terminate under clause 15 and the consequences in clause 16 apply as if we had terminated for the Client’s default. [Please confirm this is reasonable and enforceable, and advise on the notice we should give.]</w:t>
+        <w:t xml:space="preserve">During a pause we are not obliged to perform the Services, we may reallocate the reserved capacity, and on resumption we will agree a revised delivery schedule in good faith. Work already paid for is delivered in full across the extended Term.</w:t>
+      </w:r>
+    </w:p>
+    <w:p>
+      <w:pPr>
+        <w:spacing w:after="120" w:before="100" w:line="280"/>
+        <w:ind w:left="420" w:hanging="420"/>
+      </w:pPr>
+      <w:r>
+        <w:rPr>
+          <w:b/>
+          <w:bCs/>
+          <w:color w:val="2C8F88"/>
+          <w:sz w:val="21"/>
+          <w:szCs w:val="21"/>
+        </w:rPr>
+        <w:t xml:space="preserve">11.4  </w:t>
+      </w:r>
+      <w:r>
+        <w:rPr>
+          <w:sz w:val="21"/>
+          <w:szCs w:val="21"/>
+        </w:rPr>
+        <w:t xml:space="preserve">If the Client neither responds to our notice nor requests a pause within 30 days of that notice, we may terminate under clause 15. On such termination the Client is not entitled to a refund of the billing month in progress, and every other prepaid month is refunded within 14 working days under clause 16. No charge is made for months in which no Services were delivered. [Please confirm this pause-and-notice structure is reasonable and enforceable, and that we are not forfeiting anything that would read as a penalty.]</w:t>
       </w:r>
     </w:p>
     <w:p>
@@ -3781,7 +3804,7 @@
           <w:sz w:val="21"/>
           <w:szCs w:val="21"/>
         </w:rPr>
-        <w:t xml:space="preserve">Clause 11: is treating a non-cooperating engagement as inactive, with Fees remaining payable, reasonable and enforceable, and what notice should we give?</w:t>
+        <w:t xml:space="preserve">Clause 11: is the pause-and-notice structure sound? We deliberately removed any forfeiture for months in which no work was delivered, so nothing in this clause reads as a penalty. Is 30 days notice plus a 60-day pause right the correct balance?</w:t>
       </w:r>
     </w:p>
     <w:p>

</xml_diff>